<commit_message>
add state diagram into srs
</commit_message>
<xml_diff>
--- a/SRS.docx
+++ b/SRS.docx
@@ -668,7 +668,7 @@
     </w:p>
     <w:p>
       <w:r>
-        <w:t>Section 2 describes the product context and actors. Section 3 shows system architecture. Section 4 gives the use-case model. Section 5 lists detailed functional requirements per feature. Sections 6–8 provide DFDs, the ER/graph data model, and sequence diagrams. Sections 9–11 cover interfaces, non-functional requirements, and constraints.</w:t>
+        <w:t>Section 2 describes the product context and actors. Section 3 shows system architecture. Section 4 gives the use-case model. Section 5 lists detailed functional requirements per feature. Sections 6–9 provide DFDs, the ER/graph data model, sequence diagrams, and the session state diagram. Sections 10–12 cover interfaces, non-functional requirements, and constraints.</w:t>
       </w:r>
     </w:p>
     <w:p>
@@ -3471,7 +3471,7 @@
         <w:pStyle w:val="Heading2"/>
       </w:pPr>
       <w:r>
-        <w:t>9. External Interface Requirements</w:t>
+        <w:t>9. State Diagram</w:t>
       </w:r>
     </w:p>
     <w:p>
@@ -3479,23 +3479,277 @@
         <w:pStyle w:val="Heading3"/>
       </w:pPr>
       <w:r>
-        <w:t>9.1 User Interfaces</w:t>
+        <w:t>9.1 Session Lifecycle State Diagram</w:t>
       </w:r>
     </w:p>
     <w:p>
-      <w:pPr>
-        <w:pStyle w:val="ListBullet"/>
-      </w:pPr>
-      <w:r>
-        <w:t>Single-page application (Vue 3) with a resizable left sidebar (upload, status, search, legend, metrics, git history, smell analysis, risk, dead code, patterns, layer analysis panels) and a main canvas (Vue Flow graph with MiniMap and Controls).</w:t>
+      <w:r>
+        <w:t xml:space="preserve">The diagram below models the lifecycle states of a single user </w:t>
+      </w:r>
+      <w:r>
+        <w:rPr>
+          <w:b/>
+        </w:rPr>
+        <w:t>session</w:t>
+      </w:r>
+      <w:r>
+        <w:t xml:space="preserve"> — the central stateful entity in CodeFlow (see FR-13 and UC13) — from creation to cleanup.</w:t>
       </w:r>
     </w:p>
     <w:p>
       <w:pPr>
+        <w:jc w:val="center"/>
+      </w:pPr>
+      <w:r>
+        <w:drawing>
+          <wp:inline xmlns:a="http://schemas.openxmlformats.org/drawingml/2006/main" xmlns:pic="http://schemas.openxmlformats.org/drawingml/2006/picture">
+            <wp:extent cx="5760720" cy="6399984"/>
+            <wp:docPr id="11" name="Picture 11"/>
+            <wp:cNvGraphicFramePr>
+              <a:graphicFrameLocks noChangeAspect="1"/>
+            </wp:cNvGraphicFramePr>
+            <a:graphic>
+              <a:graphicData uri="http://schemas.openxmlformats.org/drawingml/2006/picture">
+                <pic:pic>
+                  <pic:nvPicPr>
+                    <pic:cNvPr id="0" name="diagram_10.png"/>
+                    <pic:cNvPicPr/>
+                  </pic:nvPicPr>
+                  <pic:blipFill>
+                    <a:blip r:embed="rId19"/>
+                    <a:stretch>
+                      <a:fillRect/>
+                    </a:stretch>
+                  </pic:blipFill>
+                  <pic:spPr>
+                    <a:xfrm>
+                      <a:off x="0" y="0"/>
+                      <a:ext cx="5760720" cy="6399984"/>
+                    </a:xfrm>
+                    <a:prstGeom prst="rect"/>
+                  </pic:spPr>
+                </pic:pic>
+              </a:graphicData>
+            </a:graphic>
+          </wp:inline>
+        </w:drawing>
+      </w:r>
+    </w:p>
+    <w:p>
+      <w:r>
+        <w:rPr>
+          <w:b/>
+        </w:rPr>
+        <w:t>State descriptions:</w:t>
+      </w:r>
+    </w:p>
+    <w:tbl>
+      <w:tblPr>
+        <w:tblStyle w:val="LightGrid-Accent1"/>
+        <w:tblW w:type="auto" w:w="0"/>
+        <w:jc w:val="center"/>
+        <w:tblLook w:firstColumn="1" w:firstRow="1" w:lastColumn="0" w:lastRow="0" w:noHBand="0" w:noVBand="1" w:val="04A0"/>
+      </w:tblPr>
+      <w:tblGrid>
+        <w:gridCol w:w="4320"/>
+        <w:gridCol w:w="4320"/>
+      </w:tblGrid>
+      <w:tr>
+        <w:tc>
+          <w:tcPr>
+            <w:tcW w:type="dxa" w:w="4320"/>
+            <w:shd w:val="clear" w:color="auto" w:fill="2F5496"/>
+          </w:tcPr>
+          <w:p>
+            <w:r>
+              <w:rPr>
+                <w:b/>
+                <w:color w:val="FFFFFF"/>
+              </w:rPr>
+              <w:t>State</w:t>
+            </w:r>
+          </w:p>
+        </w:tc>
+        <w:tc>
+          <w:tcPr>
+            <w:tcW w:type="dxa" w:w="4320"/>
+            <w:shd w:val="clear" w:color="auto" w:fill="2F5496"/>
+          </w:tcPr>
+          <w:p>
+            <w:r>
+              <w:rPr>
+                <w:b/>
+                <w:color w:val="FFFFFF"/>
+              </w:rPr>
+              <w:t>Meaning</w:t>
+            </w:r>
+          </w:p>
+        </w:tc>
+      </w:tr>
+      <w:tr>
+        <w:tc>
+          <w:tcPr>
+            <w:tcW w:type="dxa" w:w="4320"/>
+          </w:tcPr>
+          <w:p>
+            <w:r>
+              <w:t>**Created**</w:t>
+            </w:r>
+          </w:p>
+        </w:tc>
+        <w:tc>
+          <w:tcPr>
+            <w:tcW w:type="dxa" w:w="4320"/>
+          </w:tcPr>
+          <w:p>
+            <w:r>
+              <w:t>Session UUID issued via `POST /start-session`; no project data yet</w:t>
+            </w:r>
+          </w:p>
+        </w:tc>
+      </w:tr>
+      <w:tr>
+        <w:tc>
+          <w:tcPr>
+            <w:tcW w:type="dxa" w:w="4320"/>
+          </w:tcPr>
+          <w:p>
+            <w:r>
+              <w:t>**Active**</w:t>
+            </w:r>
+          </w:p>
+        </w:tc>
+        <w:tc>
+          <w:tcPr>
+            <w:tcW w:type="dxa" w:w="4320"/>
+          </w:tcPr>
+          <w:p>
+            <w:r>
+              <w:t>At least one upload processed; session holds a live code graph in Neo4j/cache</w:t>
+            </w:r>
+          </w:p>
+        </w:tc>
+      </w:tr>
+      <w:tr>
+        <w:tc>
+          <w:tcPr>
+            <w:tcW w:type="dxa" w:w="4320"/>
+          </w:tcPr>
+          <w:p>
+            <w:r>
+              <w:t>**Idle**</w:t>
+            </w:r>
+          </w:p>
+        </w:tc>
+        <w:tc>
+          <w:tcPr>
+            <w:tcW w:type="dxa" w:w="4320"/>
+          </w:tcPr>
+          <w:p>
+            <w:r>
+              <w:t>Session exists but has received no requests recently</w:t>
+            </w:r>
+          </w:p>
+        </w:tc>
+      </w:tr>
+      <w:tr>
+        <w:tc>
+          <w:tcPr>
+            <w:tcW w:type="dxa" w:w="4320"/>
+          </w:tcPr>
+          <w:p>
+            <w:r>
+              <w:t>**Expired**</w:t>
+            </w:r>
+          </w:p>
+        </w:tc>
+        <w:tc>
+          <w:tcPr>
+            <w:tcW w:type="dxa" w:w="4320"/>
+          </w:tcPr>
+          <w:p>
+            <w:r>
+              <w:t>Idle session that crossed the 3-hour inactivity threshold; picked up by the 30-minute background cleanup task</w:t>
+            </w:r>
+          </w:p>
+        </w:tc>
+      </w:tr>
+      <w:tr>
+        <w:tc>
+          <w:tcPr>
+            <w:tcW w:type="dxa" w:w="4320"/>
+          </w:tcPr>
+          <w:p>
+            <w:r>
+              <w:t>**Ended**</w:t>
+            </w:r>
+          </w:p>
+        </w:tc>
+        <w:tc>
+          <w:tcPr>
+            <w:tcW w:type="dxa" w:w="4320"/>
+          </w:tcPr>
+          <w:p>
+            <w:r>
+              <w:t>User explicitly closed the tab/session (`DELETE /end-session` via `sendBeacon`)</w:t>
+            </w:r>
+          </w:p>
+        </w:tc>
+      </w:tr>
+      <w:tr>
+        <w:tc>
+          <w:tcPr>
+            <w:tcW w:type="dxa" w:w="4320"/>
+          </w:tcPr>
+          <w:p>
+            <w:r>
+              <w:t>**Cleaned**</w:t>
+            </w:r>
+          </w:p>
+        </w:tc>
+        <w:tc>
+          <w:tcPr>
+            <w:tcW w:type="dxa" w:w="4320"/>
+          </w:tcPr>
+          <w:p>
+            <w:r>
+              <w:t>Terminal housekeeping state — Neo4j nodes, disk uploads, and in-memory cache for the session are deleted</w:t>
+            </w:r>
+          </w:p>
+        </w:tc>
+      </w:tr>
+    </w:tbl>
+    <w:p/>
+    <w:p>
+      <w:pPr>
+        <w:pStyle w:val="Heading2"/>
+      </w:pPr>
+      <w:r>
+        <w:t>10. External Interface Requirements</w:t>
+      </w:r>
+    </w:p>
+    <w:p>
+      <w:pPr>
         <w:pStyle w:val="Heading3"/>
       </w:pPr>
       <w:r>
-        <w:t>9.2 Software Interfaces (REST API)</w:t>
+        <w:t>10.1 User Interfaces</w:t>
+      </w:r>
+    </w:p>
+    <w:p>
+      <w:pPr>
+        <w:pStyle w:val="ListBullet"/>
+      </w:pPr>
+      <w:r>
+        <w:t>Single-page application (Vue 3) with a resizable left sidebar (upload, status, search, legend, metrics, git history, smell analysis, risk, dead code, patterns, layer analysis panels) and a main canvas (Vue Flow graph with MiniMap and Controls).</w:t>
+      </w:r>
+    </w:p>
+    <w:p>
+      <w:pPr>
+        <w:pStyle w:val="Heading3"/>
+      </w:pPr>
+      <w:r>
+        <w:t>10.2 Software Interfaces (REST API)</w:t>
       </w:r>
     </w:p>
     <w:tbl>
@@ -4236,7 +4490,7 @@
         <w:pStyle w:val="Heading3"/>
       </w:pPr>
       <w:r>
-        <w:t>9.3 Communication Interfaces</w:t>
+        <w:t>10.3 Communication Interfaces</w:t>
       </w:r>
     </w:p>
     <w:p>
@@ -4278,7 +4532,7 @@
         <w:pStyle w:val="Heading2"/>
       </w:pPr>
       <w:r>
-        <w:t>10. Non-Functional Requirements</w:t>
+        <w:t>11. Non-Functional Requirements</w:t>
       </w:r>
     </w:p>
     <w:tbl>
@@ -4485,7 +4739,7 @@
         <w:pStyle w:val="Heading2"/>
       </w:pPr>
       <w:r>
-        <w:t>11. Other Constraints &amp; Assumptions</w:t>
+        <w:t>12. Other Constraints &amp; Assumptions</w:t>
       </w:r>
     </w:p>
     <w:p>

</xml_diff>